<commit_message>
docs: update README with submission deliverables, reviewer guide, and engineering solutions
</commit_message>
<xml_diff>
--- a/submission/Nebula.doc.docx
+++ b/submission/Nebula.doc.docx
@@ -39,6 +39,74 @@
     <w:p>
       <w:pPr>
         <w:ind w:firstLine="720"/>
+        <w:rPr>
+          <w:b/>
+          <w:bCs/>
+        </w:rPr>
+      </w:pPr>
+    </w:p>
+    <w:p>
+      <w:pPr>
+        <w:ind w:firstLine="720"/>
+        <w:rPr>
+          <w:b/>
+          <w:bCs/>
+        </w:rPr>
+      </w:pPr>
+      <w:r>
+        <w:rPr>
+          <w:b/>
+          <w:bCs/>
+        </w:rPr>
+        <w:drawing>
+          <wp:inline distT="0" distB="0" distL="0" distR="0" wp14:anchorId="219AC45E" wp14:editId="4163AADF">
+            <wp:extent cx="5731510" cy="2048510"/>
+            <wp:effectExtent l="0" t="0" r="2540" b="8890"/>
+            <wp:docPr id="1190858259" name="Picture 1"/>
+            <wp:cNvGraphicFramePr>
+              <a:graphicFrameLocks xmlns:a="http://schemas.openxmlformats.org/drawingml/2006/main" noChangeAspect="1"/>
+            </wp:cNvGraphicFramePr>
+            <a:graphic xmlns:a="http://schemas.openxmlformats.org/drawingml/2006/main">
+              <a:graphicData uri="http://schemas.openxmlformats.org/drawingml/2006/picture">
+                <pic:pic xmlns:pic="http://schemas.openxmlformats.org/drawingml/2006/picture">
+                  <pic:nvPicPr>
+                    <pic:cNvPr id="1190858259" name=""/>
+                    <pic:cNvPicPr/>
+                  </pic:nvPicPr>
+                  <pic:blipFill>
+                    <a:blip r:embed="rId5"/>
+                    <a:stretch>
+                      <a:fillRect/>
+                    </a:stretch>
+                  </pic:blipFill>
+                  <pic:spPr>
+                    <a:xfrm>
+                      <a:off x="0" y="0"/>
+                      <a:ext cx="5731510" cy="2048510"/>
+                    </a:xfrm>
+                    <a:prstGeom prst="rect">
+                      <a:avLst/>
+                    </a:prstGeom>
+                  </pic:spPr>
+                </pic:pic>
+              </a:graphicData>
+            </a:graphic>
+          </wp:inline>
+        </w:drawing>
+      </w:r>
+    </w:p>
+    <w:p>
+      <w:pPr>
+        <w:ind w:firstLine="720"/>
+        <w:rPr>
+          <w:b/>
+          <w:bCs/>
+        </w:rPr>
+      </w:pPr>
+    </w:p>
+    <w:p>
+      <w:pPr>
+        <w:ind w:firstLine="720"/>
       </w:pPr>
       <w:r>
         <w:t xml:space="preserve">1. </w:t>
@@ -70,7 +138,7 @@
       <w:r>
         <w:t> </w:t>
       </w:r>
-      <w:hyperlink r:id="rId5" w:history="1">
+      <w:hyperlink r:id="rId6" w:history="1">
         <w:r>
           <w:rPr>
             <w:rStyle w:val="Hyperlink"/>
@@ -286,6 +354,7 @@
           <w:b/>
           <w:bCs/>
         </w:rPr>
+        <w:lastRenderedPageBreak/>
         <w:t>Inventory:</w:t>
       </w:r>
       <w:r>
@@ -395,7 +464,6 @@
         <w:ind w:firstLine="720"/>
       </w:pPr>
       <w:r>
-        <w:lastRenderedPageBreak/>
         <w:t xml:space="preserve">4. </w:t>
       </w:r>
       <w:r>
@@ -650,6 +718,7 @@
           <w:b/>
           <w:bCs/>
         </w:rPr>
+        <w:lastRenderedPageBreak/>
         <w:t>Render Free-Tier Keep-Alive:</w:t>
       </w:r>
       <w:r>
@@ -697,7 +766,7 @@
       <w:r>
         <w:t> </w:t>
       </w:r>
-      <w:hyperlink r:id="rId6" w:history="1">
+      <w:hyperlink r:id="rId7" w:history="1">
         <w:r>
           <w:rPr>
             <w:rStyle w:val="Hyperlink"/>
@@ -723,7 +792,7 @@
       <w:r>
         <w:t> </w:t>
       </w:r>
-      <w:hyperlink r:id="rId7" w:history="1">
+      <w:hyperlink r:id="rId8" w:history="1">
         <w:r>
           <w:rPr>
             <w:rStyle w:val="Hyperlink"/>

</xml_diff>

<commit_message>
docs: update Nebula project submission document
</commit_message>
<xml_diff>
--- a/submission/Nebula.doc.docx
+++ b/submission/Nebula.doc.docx
@@ -57,6 +57,7 @@
         <w:rPr>
           <w:b/>
           <w:bCs/>
+          <w:noProof/>
         </w:rPr>
         <w:drawing>
           <wp:inline distT="0" distB="0" distL="0" distR="0" wp14:anchorId="219AC45E" wp14:editId="4163AADF">
@@ -731,7 +732,7 @@
       </w:pPr>
       <w:r>
         <w:pict w14:anchorId="399E6554">
-          <v:rect id="_x0000_i1038" style="width:564pt;height:.75pt" o:hrpct="0" o:hralign="center" o:hrstd="t" o:hr="t" fillcolor="#a0a0a0" stroked="f"/>
+          <v:rect id="_x0000_i1025" style="width:564pt;height:.75pt" o:hrpct="0" o:hralign="center" o:hrstd="t" o:hr="t" fillcolor="#a0a0a0" stroked="f"/>
         </w:pict>
       </w:r>
     </w:p>
@@ -751,9 +752,10 @@
     </w:p>
     <w:p>
       <w:pPr>
+        <w:pStyle w:val="ListParagraph"/>
         <w:numPr>
           <w:ilvl w:val="0"/>
-          <w:numId w:val="7"/>
+          <w:numId w:val="9"/>
         </w:numPr>
       </w:pPr>
       <w:r>
@@ -761,12 +763,103 @@
           <w:b/>
           <w:bCs/>
         </w:rPr>
+        <w:t>Live Telegram Bot:</w:t>
+      </w:r>
+      <w:r>
+        <w:t> </w:t>
+      </w:r>
+      <w:hyperlink r:id="rId7" w:history="1">
+        <w:r>
+          <w:rPr>
+            <w:rStyle w:val="Hyperlink"/>
+          </w:rPr>
+          <w:t>@superm</w:t>
+        </w:r>
+        <w:r>
+          <w:rPr>
+            <w:rStyle w:val="Hyperlink"/>
+          </w:rPr>
+          <w:t>a</w:t>
+        </w:r>
+        <w:r>
+          <w:rPr>
+            <w:rStyle w:val="Hyperlink"/>
+          </w:rPr>
+          <w:t>rket_ops_nebula_bot</w:t>
+        </w:r>
+      </w:hyperlink>
+    </w:p>
+    <w:p>
+      <w:pPr>
+        <w:pStyle w:val="ListParagraph"/>
+        <w:ind w:left="1080"/>
+      </w:pPr>
+    </w:p>
+    <w:p>
+      <w:pPr>
+        <w:pStyle w:val="ListParagraph"/>
+        <w:numPr>
+          <w:ilvl w:val="0"/>
+          <w:numId w:val="9"/>
+        </w:numPr>
+      </w:pPr>
+      <w:r>
+        <w:rPr>
+          <w:b/>
+          <w:bCs/>
+        </w:rPr>
+        <w:t>Git Link:</w:t>
+      </w:r>
+      <w:r>
+        <w:t xml:space="preserve"> </w:t>
+      </w:r>
+      <w:hyperlink r:id="rId8" w:history="1">
+        <w:r>
+          <w:rPr>
+            <w:rStyle w:val="Hyperlink"/>
+            <w:smallCaps/>
+          </w:rPr>
+          <w:t>https://github.com/akishorekumar-</w:t>
+        </w:r>
+        <w:r>
+          <w:rPr>
+            <w:rStyle w:val="Hyperlink"/>
+            <w:smallCaps/>
+          </w:rPr>
+          <w:t>1</w:t>
+        </w:r>
+        <w:r>
+          <w:rPr>
+            <w:rStyle w:val="Hyperlink"/>
+            <w:smallCaps/>
+          </w:rPr>
+          <w:t>728/supermarket-ops-agent</w:t>
+        </w:r>
+      </w:hyperlink>
+    </w:p>
+    <w:p>
+      <w:pPr>
+        <w:pStyle w:val="ListParagraph"/>
+      </w:pPr>
+    </w:p>
+    <w:p>
+      <w:pPr>
+        <w:numPr>
+          <w:ilvl w:val="0"/>
+          <w:numId w:val="9"/>
+        </w:numPr>
+      </w:pPr>
+      <w:r>
+        <w:rPr>
+          <w:b/>
+          <w:bCs/>
+        </w:rPr>
         <w:t>Direct Report on GitHub:</w:t>
       </w:r>
       <w:r>
         <w:t> </w:t>
       </w:r>
-      <w:hyperlink r:id="rId7" w:history="1">
+      <w:hyperlink r:id="rId9" w:history="1">
         <w:r>
           <w:rPr>
             <w:rStyle w:val="Hyperlink"/>
@@ -777,47 +870,23 @@
     </w:p>
     <w:p>
       <w:pPr>
-        <w:numPr>
-          <w:ilvl w:val="0"/>
-          <w:numId w:val="7"/>
-        </w:numPr>
-      </w:pPr>
-      <w:r>
-        <w:rPr>
-          <w:b/>
-          <w:bCs/>
-        </w:rPr>
-        <w:t>Live Telegram Bot:</w:t>
-      </w:r>
-      <w:r>
-        <w:t> </w:t>
-      </w:r>
-      <w:hyperlink r:id="rId8" w:history="1">
-        <w:r>
-          <w:rPr>
-            <w:rStyle w:val="Hyperlink"/>
-          </w:rPr>
-          <w:t>@supermarket_ops_</w:t>
-        </w:r>
-        <w:r>
-          <w:rPr>
-            <w:rStyle w:val="Hyperlink"/>
-          </w:rPr>
-          <w:t>n</w:t>
-        </w:r>
-        <w:r>
-          <w:rPr>
-            <w:rStyle w:val="Hyperlink"/>
-          </w:rPr>
-          <w:t>ebula_bot</w:t>
-        </w:r>
-      </w:hyperlink>
-    </w:p>
-    <w:p>
-      <w:pPr>
-        <w:ind w:firstLine="720"/>
-      </w:pPr>
-    </w:p>
+        <w:pStyle w:val="ListParagraph"/>
+        <w:ind w:left="1080"/>
+      </w:pPr>
+    </w:p>
+    <w:p>
+      <w:pPr>
+        <w:pStyle w:val="ListParagraph"/>
+        <w:ind w:left="1080"/>
+      </w:pPr>
+      <w:r>
+        <w:br/>
+      </w:r>
+      <w:r>
+        <w:br/>
+      </w:r>
+    </w:p>
+    <w:p/>
     <w:sectPr>
       <w:pgSz w:w="11906" w:h="16838"/>
       <w:pgMar w:top="1440" w:right="1440" w:bottom="1440" w:left="1440" w:header="708" w:footer="708" w:gutter="0"/>
@@ -980,6 +1049,95 @@
     </w:lvl>
   </w:abstractNum>
   <w:abstractNum w:abstractNumId="1" w15:restartNumberingAfterBreak="0">
+    <w:nsid w:val="08E55711"/>
+    <w:multiLevelType w:val="hybridMultilevel"/>
+    <w:tmpl w:val="E1E4A5E0"/>
+    <w:lvl w:ilvl="0" w:tplc="40090001">
+      <w:start w:val="1"/>
+      <w:numFmt w:val="bullet"/>
+      <w:lvlText w:val=""/>
+      <w:lvlJc w:val="left"/>
+      <w:pPr>
+        <w:ind w:left="1080" w:hanging="360"/>
+      </w:pPr>
+      <w:rPr>
+        <w:rFonts w:ascii="Symbol" w:hAnsi="Symbol" w:hint="default"/>
+      </w:rPr>
+    </w:lvl>
+    <w:lvl w:ilvl="1" w:tplc="FFFFFFFF" w:tentative="1">
+      <w:start w:val="1"/>
+      <w:numFmt w:val="lowerLetter"/>
+      <w:lvlText w:val="%2."/>
+      <w:lvlJc w:val="left"/>
+      <w:pPr>
+        <w:ind w:left="1800" w:hanging="360"/>
+      </w:pPr>
+    </w:lvl>
+    <w:lvl w:ilvl="2" w:tplc="FFFFFFFF" w:tentative="1">
+      <w:start w:val="1"/>
+      <w:numFmt w:val="lowerRoman"/>
+      <w:lvlText w:val="%3."/>
+      <w:lvlJc w:val="right"/>
+      <w:pPr>
+        <w:ind w:left="2520" w:hanging="180"/>
+      </w:pPr>
+    </w:lvl>
+    <w:lvl w:ilvl="3" w:tplc="FFFFFFFF" w:tentative="1">
+      <w:start w:val="1"/>
+      <w:numFmt w:val="decimal"/>
+      <w:lvlText w:val="%4."/>
+      <w:lvlJc w:val="left"/>
+      <w:pPr>
+        <w:ind w:left="3240" w:hanging="360"/>
+      </w:pPr>
+    </w:lvl>
+    <w:lvl w:ilvl="4" w:tplc="FFFFFFFF" w:tentative="1">
+      <w:start w:val="1"/>
+      <w:numFmt w:val="lowerLetter"/>
+      <w:lvlText w:val="%5."/>
+      <w:lvlJc w:val="left"/>
+      <w:pPr>
+        <w:ind w:left="3960" w:hanging="360"/>
+      </w:pPr>
+    </w:lvl>
+    <w:lvl w:ilvl="5" w:tplc="FFFFFFFF" w:tentative="1">
+      <w:start w:val="1"/>
+      <w:numFmt w:val="lowerRoman"/>
+      <w:lvlText w:val="%6."/>
+      <w:lvlJc w:val="right"/>
+      <w:pPr>
+        <w:ind w:left="4680" w:hanging="180"/>
+      </w:pPr>
+    </w:lvl>
+    <w:lvl w:ilvl="6" w:tplc="FFFFFFFF" w:tentative="1">
+      <w:start w:val="1"/>
+      <w:numFmt w:val="decimal"/>
+      <w:lvlText w:val="%7."/>
+      <w:lvlJc w:val="left"/>
+      <w:pPr>
+        <w:ind w:left="5400" w:hanging="360"/>
+      </w:pPr>
+    </w:lvl>
+    <w:lvl w:ilvl="7" w:tplc="FFFFFFFF" w:tentative="1">
+      <w:start w:val="1"/>
+      <w:numFmt w:val="lowerLetter"/>
+      <w:lvlText w:val="%8."/>
+      <w:lvlJc w:val="left"/>
+      <w:pPr>
+        <w:ind w:left="6120" w:hanging="360"/>
+      </w:pPr>
+    </w:lvl>
+    <w:lvl w:ilvl="8" w:tplc="FFFFFFFF" w:tentative="1">
+      <w:start w:val="1"/>
+      <w:numFmt w:val="lowerRoman"/>
+      <w:lvlText w:val="%9."/>
+      <w:lvlJc w:val="right"/>
+      <w:pPr>
+        <w:ind w:left="6840" w:hanging="180"/>
+      </w:pPr>
+    </w:lvl>
+  </w:abstractNum>
+  <w:abstractNum w:abstractNumId="2" w15:restartNumberingAfterBreak="0">
     <w:nsid w:val="25795B75"/>
     <w:multiLevelType w:val="multilevel"/>
     <w:tmpl w:val="C6E4B52A"/>
@@ -1128,7 +1286,93 @@
       </w:rPr>
     </w:lvl>
   </w:abstractNum>
-  <w:abstractNum w:abstractNumId="2" w15:restartNumberingAfterBreak="0">
+  <w:abstractNum w:abstractNumId="3" w15:restartNumberingAfterBreak="0">
+    <w:nsid w:val="55F56B10"/>
+    <w:multiLevelType w:val="hybridMultilevel"/>
+    <w:tmpl w:val="037A96CC"/>
+    <w:lvl w:ilvl="0" w:tplc="4009000F">
+      <w:start w:val="1"/>
+      <w:numFmt w:val="decimal"/>
+      <w:lvlText w:val="%1."/>
+      <w:lvlJc w:val="left"/>
+      <w:pPr>
+        <w:ind w:left="1080" w:hanging="360"/>
+      </w:pPr>
+    </w:lvl>
+    <w:lvl w:ilvl="1" w:tplc="40090019" w:tentative="1">
+      <w:start w:val="1"/>
+      <w:numFmt w:val="lowerLetter"/>
+      <w:lvlText w:val="%2."/>
+      <w:lvlJc w:val="left"/>
+      <w:pPr>
+        <w:ind w:left="1800" w:hanging="360"/>
+      </w:pPr>
+    </w:lvl>
+    <w:lvl w:ilvl="2" w:tplc="4009001B" w:tentative="1">
+      <w:start w:val="1"/>
+      <w:numFmt w:val="lowerRoman"/>
+      <w:lvlText w:val="%3."/>
+      <w:lvlJc w:val="right"/>
+      <w:pPr>
+        <w:ind w:left="2520" w:hanging="180"/>
+      </w:pPr>
+    </w:lvl>
+    <w:lvl w:ilvl="3" w:tplc="4009000F" w:tentative="1">
+      <w:start w:val="1"/>
+      <w:numFmt w:val="decimal"/>
+      <w:lvlText w:val="%4."/>
+      <w:lvlJc w:val="left"/>
+      <w:pPr>
+        <w:ind w:left="3240" w:hanging="360"/>
+      </w:pPr>
+    </w:lvl>
+    <w:lvl w:ilvl="4" w:tplc="40090019" w:tentative="1">
+      <w:start w:val="1"/>
+      <w:numFmt w:val="lowerLetter"/>
+      <w:lvlText w:val="%5."/>
+      <w:lvlJc w:val="left"/>
+      <w:pPr>
+        <w:ind w:left="3960" w:hanging="360"/>
+      </w:pPr>
+    </w:lvl>
+    <w:lvl w:ilvl="5" w:tplc="4009001B" w:tentative="1">
+      <w:start w:val="1"/>
+      <w:numFmt w:val="lowerRoman"/>
+      <w:lvlText w:val="%6."/>
+      <w:lvlJc w:val="right"/>
+      <w:pPr>
+        <w:ind w:left="4680" w:hanging="180"/>
+      </w:pPr>
+    </w:lvl>
+    <w:lvl w:ilvl="6" w:tplc="4009000F" w:tentative="1">
+      <w:start w:val="1"/>
+      <w:numFmt w:val="decimal"/>
+      <w:lvlText w:val="%7."/>
+      <w:lvlJc w:val="left"/>
+      <w:pPr>
+        <w:ind w:left="5400" w:hanging="360"/>
+      </w:pPr>
+    </w:lvl>
+    <w:lvl w:ilvl="7" w:tplc="40090019" w:tentative="1">
+      <w:start w:val="1"/>
+      <w:numFmt w:val="lowerLetter"/>
+      <w:lvlText w:val="%8."/>
+      <w:lvlJc w:val="left"/>
+      <w:pPr>
+        <w:ind w:left="6120" w:hanging="360"/>
+      </w:pPr>
+    </w:lvl>
+    <w:lvl w:ilvl="8" w:tplc="4009001B" w:tentative="1">
+      <w:start w:val="1"/>
+      <w:numFmt w:val="lowerRoman"/>
+      <w:lvlText w:val="%9."/>
+      <w:lvlJc w:val="right"/>
+      <w:pPr>
+        <w:ind w:left="6840" w:hanging="180"/>
+      </w:pPr>
+    </w:lvl>
+  </w:abstractNum>
+  <w:abstractNum w:abstractNumId="4" w15:restartNumberingAfterBreak="0">
     <w:nsid w:val="57DD0939"/>
     <w:multiLevelType w:val="multilevel"/>
     <w:tmpl w:val="E1446E70"/>
@@ -1277,7 +1521,7 @@
       </w:rPr>
     </w:lvl>
   </w:abstractNum>
-  <w:abstractNum w:abstractNumId="3" w15:restartNumberingAfterBreak="0">
+  <w:abstractNum w:abstractNumId="5" w15:restartNumberingAfterBreak="0">
     <w:nsid w:val="6424185B"/>
     <w:multiLevelType w:val="multilevel"/>
     <w:tmpl w:val="23641A56"/>
@@ -1426,7 +1670,7 @@
       </w:rPr>
     </w:lvl>
   </w:abstractNum>
-  <w:abstractNum w:abstractNumId="4" w15:restartNumberingAfterBreak="0">
+  <w:abstractNum w:abstractNumId="6" w15:restartNumberingAfterBreak="0">
     <w:nsid w:val="6BAF6353"/>
     <w:multiLevelType w:val="multilevel"/>
     <w:tmpl w:val="50A4F7F4"/>
@@ -1575,7 +1819,7 @@
       </w:rPr>
     </w:lvl>
   </w:abstractNum>
-  <w:abstractNum w:abstractNumId="5" w15:restartNumberingAfterBreak="0">
+  <w:abstractNum w:abstractNumId="7" w15:restartNumberingAfterBreak="0">
     <w:nsid w:val="71853AEC"/>
     <w:multiLevelType w:val="multilevel"/>
     <w:tmpl w:val="6FFEBD08"/>
@@ -1724,7 +1968,7 @@
       </w:rPr>
     </w:lvl>
   </w:abstractNum>
-  <w:abstractNum w:abstractNumId="6" w15:restartNumberingAfterBreak="0">
+  <w:abstractNum w:abstractNumId="8" w15:restartNumberingAfterBreak="0">
     <w:nsid w:val="77D45056"/>
     <w:multiLevelType w:val="multilevel"/>
     <w:tmpl w:val="6D942B80"/>
@@ -1874,25 +2118,31 @@
     </w:lvl>
   </w:abstractNum>
   <w:num w:numId="1" w16cid:durableId="1592811115">
-    <w:abstractNumId w:val="3"/>
+    <w:abstractNumId w:val="5"/>
   </w:num>
   <w:num w:numId="2" w16cid:durableId="1046174936">
-    <w:abstractNumId w:val="5"/>
+    <w:abstractNumId w:val="7"/>
   </w:num>
   <w:num w:numId="3" w16cid:durableId="1921058978">
     <w:abstractNumId w:val="0"/>
   </w:num>
   <w:num w:numId="4" w16cid:durableId="1840925873">
+    <w:abstractNumId w:val="6"/>
+  </w:num>
+  <w:num w:numId="5" w16cid:durableId="573246882">
     <w:abstractNumId w:val="4"/>
   </w:num>
-  <w:num w:numId="5" w16cid:durableId="573246882">
+  <w:num w:numId="6" w16cid:durableId="1042940353">
     <w:abstractNumId w:val="2"/>
   </w:num>
-  <w:num w:numId="6" w16cid:durableId="1042940353">
+  <w:num w:numId="7" w16cid:durableId="622466382">
+    <w:abstractNumId w:val="8"/>
+  </w:num>
+  <w:num w:numId="8" w16cid:durableId="34239324">
+    <w:abstractNumId w:val="3"/>
+  </w:num>
+  <w:num w:numId="9" w16cid:durableId="1572276571">
     <w:abstractNumId w:val="1"/>
-  </w:num>
-  <w:num w:numId="7" w16cid:durableId="622466382">
-    <w:abstractNumId w:val="6"/>
   </w:num>
 </w:numbering>
 </file>
@@ -2297,6 +2547,7 @@
   <w:style w:type="paragraph" w:default="1" w:styleId="Normal">
     <w:name w:val="Normal"/>
     <w:qFormat/>
+    <w:rsid w:val="00200C9B"/>
   </w:style>
   <w:style w:type="paragraph" w:styleId="Heading1">
     <w:name w:val="heading 1"/>

</xml_diff>